<commit_message>
Estandarizacion 100% canonica de nombres originales en toda la saga Oni no Ketsuryu (Vol 1 al 10)
</commit_message>
<xml_diff>
--- a/libros/oni-no-ketsuryu-volumen-8/libro.docx
+++ b/libros/oni-no-ketsuryu-volumen-8/libro.docx
@@ -103,7 +103,7 @@
         <w:spacing w:line="276" w:lineRule="auto" w:after="200"/>
       </w:pPr>
       <w:r>
-        <w:t>En las profundidades del Castillo Infinito, los cazadores enfrentan las pruebas más sangrientas contra los Tres Lunares Rojos. Ren descubre el Estado de Anulación de Intención contra el compás marcial de Rikudo; Kanae desata la estrategia del veneno de glicina contra Kagura; y los cazadores unen sus Hojas Rojas en la heroica caída de Kurogane. Al romper la fortaleza, Muzan emerge en los tejados e inicia la cuenta regresiva final de noventa minutos hasta el amanecer.</w:t>
+        <w:t>En las profundidades del Castillo Infinito, los cazadores enfrentan las pruebas más sangrientas contra los Tres Lunares Rojos. Ren descubre el Estado de Anulación de Intención contra el compás marcial de Rikudo; Aoi desata la estrategia del veneno de glicina contra Kagura; y los cazadores unen sus Hojas Rojas en la heroica caída de Kurogane. Al romper la fortaleza, Kageyama emerge en los tejados e inicia la cuenta regresiva final de noventa minutos hasta el amanecer.</w:t>
       </w:r>
     </w:p>
     <w:p>
@@ -833,7 +833,7 @@
     </w:p>
     <w:p>
       <w:r>
-        <w:t>El capullo de carne estalló en la plaza pública. Muzan emergió con latigazos de materia oscura. Los Pilares supervivientes formaron línea en la calle: comenzaba la batalla final de 90 minutos hasta el amanecer...</w:t>
+        <w:t>El capullo de carne estalló en la plaza pública. Kageyama emergió con latigazos de materia oscura. Los Pilares supervivientes formaron línea en la calle: comenzaba la batalla final de 90 minutos hasta el amanecer...</w:t>
       </w:r>
     </w:p>
     <w:p>

</xml_diff>

<commit_message>
Reemplazo completo de terminologia comercial por conceptos 100% originales en toda la saga Oni no Ketsuryu
</commit_message>
<xml_diff>
--- a/libros/oni-no-ketsuryu-volumen-8/libro.docx
+++ b/libros/oni-no-ketsuryu-volumen-8/libro.docx
@@ -103,7 +103,7 @@
         <w:spacing w:line="276" w:lineRule="auto" w:after="200"/>
       </w:pPr>
       <w:r>
-        <w:t>En las profundidades del Castillo Infinito, los cazadores enfrentan las pruebas más sangrientas contra los Tres Lunares Rojos. Ren descubre el Estado de Anulación de Intención contra el compás marcial de Rikudo; Aoi desata la estrategia del veneno de glicina contra Kagura; y los cazadores unen sus Hojas Rojas en la heroica caída de Kurogane. Al romper la fortaleza, Kageyama emerge en los tejados e inicia la cuenta regresiva final de noventa minutos hasta el amanecer.</w:t>
+        <w:t>En las profundidades del Castillo Infinito, los cazadores enfrentan las pruebas más sangrientas contra los Tres Estirpes de Sangre. Ren descubre el Estado de Anulación de Intención contra el compás marcial de Rikudo; Aoi desata la estrategia del veneno de glicina contra Kagura; y los cazadores unen sus Hojas Rojas en la heroica caída de Kurogane. Al romper la fortaleza, Kageyama emerge en los tejados e inicia la cuenta regresiva final de noventa minutos hasta el amanecer.</w:t>
       </w:r>
     </w:p>
     <w:p>
@@ -833,7 +833,7 @@
     </w:p>
     <w:p>
       <w:r>
-        <w:t>El capullo de carne estalló en la plaza pública. Kageyama emergió con latigazos de materia oscura. Los Pilares supervivientes formaron línea en la calle: comenzaba la batalla final de 90 minutos hasta el amanecer...</w:t>
+        <w:t>El capullo de carne estalló en la plaza pública. Kageyama emergió con latigazos de materia oscura. Los Maestros Celestiales supervivientes formaron línea en la calle: comenzaba la batalla final de 90 minutos hasta el amanecer...</w:t>
       </w:r>
     </w:p>
     <w:p>

</xml_diff>